<commit_message>
Replace annual plans with checked 1405 editions and remove obsolete deliveries
Co-authored-by: arena-agent <297053741+arena-agent@users.noreply.github.com>
</commit_message>
<xml_diff>
--- a/برنامه تحصیلی/۰۸ - اردیبهشت/۲۴ اردیبهشت/برنامه آزمون ۲۴ اردیبهشت ۱۴۰۶.docx
+++ b/برنامه تحصیلی/۰۸ - اردیبهشت/۲۴ اردیبهشت/برنامه آزمون ۲۴ اردیبهشت ۱۴۰۶.docx
@@ -173,7 +173,7 @@
           <w:szCs w:val="20"/>
           <w:rtl w:val="1"/>
         </w:rPr>
-        <w:t>ارجاع صفحه‌های شیمی با برچسب «ص ماز» مربوط به جدول ماز است. چاپ فایل‌های کتاب یکسان نیست؛ مرز موضوعی را تطبیق دهید و عدد ماز را شمارهٔ قطعی کتاب خود فرض نکنید.</w:t>
+        <w:t>شماره‌ها صفحهٔ چاپی کتاب‌های ۱۴۰۵ هستند، نه شمارهٔ صفحهٔ PDF. صفحهٔ مشترک مرزی فقط تا عنوان تعیین‌شده مطالعه شود. تعداد صفحات، گسترهٔ بودجه است نه تعهد خواندن کامل در مرورهای جامع.</w:t>
       </w:r>
     </w:p>
     <w:p>
@@ -1719,7 +1719,7 @@
                 <w:szCs w:val="18"/>
                 <w:rtl w:val="1"/>
               </w:rPr>
-              <w:t>فصل ۵، گفتار ۱–۳ + فصل ۶، گفتار ۱؛ ص ۶۳–۸۱</w:t>
+              <w:t>فصل ۵ گ۱–۳؛ ص۶۳–۷۶ / فصل ۶ گ۱–۲؛ ص۷۷–۸۵؛ ۲۳ صفحه</w:t>
             </w:r>
           </w:p>
           <w:p>
@@ -1893,7 +1893,7 @@
                 <w:szCs w:val="18"/>
                 <w:rtl w:val="1"/>
               </w:rPr>
-              <w:t>فصل ۵، گفتار ۱–۳ + فصل ۶، گفتار ۱؛ ص ۶۳–۸۱</w:t>
+              <w:t>فصل ۵ گ۱–۳؛ ص۶۳–۷۶ / فصل ۶ گ۱–۲؛ ص۷۷–۸۵؛ ۲۳ صفحه</w:t>
             </w:r>
           </w:p>
           <w:p>
@@ -2592,7 +2592,7 @@
                 <w:szCs w:val="18"/>
                 <w:rtl w:val="1"/>
               </w:rPr>
-              <w:t>مشتق و پیوستگی</w:t>
+              <w:t>دوازدهم؛ مشتق و پیوستگی</w:t>
             </w:r>
           </w:p>
           <w:p>
@@ -2679,7 +2679,7 @@
                 <w:szCs w:val="18"/>
                 <w:rtl w:val="1"/>
               </w:rPr>
-              <w:t>فصل ۵، گفتار ۱–۳ + فصل ۶، گفتار ۱؛ ص ۶۳–۸۱</w:t>
+              <w:t>فصل ۵ گ۱–۳؛ ص۶۳–۷۶ / فصل ۶ گ۱–۲؛ ص۷۷–۸۵؛ ۲۳ صفحه</w:t>
             </w:r>
           </w:p>
           <w:p>
@@ -3795,7 +3795,7 @@
                 <w:szCs w:val="18"/>
                 <w:rtl w:val="1"/>
               </w:rPr>
-              <w:t>هنر و ماندگاری + آیندهٔ روشن‌تر؛ ص ماز ۶۷–۸۵</w:t>
+              <w:t>هنر و ماندگاری + آیندهٔ روشن‌تر؛ ص۶۷–۸۵؛ ۱۹ صفحه</w:t>
             </w:r>
           </w:p>
           <w:p>
@@ -4581,7 +4581,7 @@
                 <w:szCs w:val="18"/>
                 <w:rtl w:val="1"/>
               </w:rPr>
-              <w:t>هنر و ماندگاری + آیندهٔ روشن‌تر؛ ص ماز ۶۷–۸۵</w:t>
+              <w:t>هنر و ماندگاری + آیندهٔ روشن‌تر؛ ص۶۷–۸۵؛ ۱۹ صفحه</w:t>
             </w:r>
           </w:p>
           <w:p>
@@ -5636,7 +5636,7 @@
                 <w:szCs w:val="18"/>
                 <w:rtl w:val="1"/>
               </w:rPr>
-              <w:t>فصل ۶، گفتار ۲–۳ + فصل ۷، گفتار ۱–۲؛ ص ۸۲–۱۰۰</w:t>
+              <w:t>فصل ۶ گ۳؛ ص۸۶–۹۰ / فصل ۷ گ۱–۳؛ ص۹۱–۱۰۶؛ ۲۱ صفحه</w:t>
             </w:r>
           </w:p>
           <w:p>
@@ -5723,7 +5723,7 @@
                 <w:szCs w:val="18"/>
                 <w:rtl w:val="1"/>
               </w:rPr>
-              <w:t>آهنگ تغییر و قواعد مشتق</w:t>
+              <w:t>دوازدهم؛ آهنگ تغییر و قواعد مشتق</w:t>
             </w:r>
           </w:p>
           <w:p>
@@ -5810,7 +5810,7 @@
                 <w:szCs w:val="18"/>
                 <w:rtl w:val="1"/>
               </w:rPr>
-              <w:t>فصل ۶، گفتار ۲–۳ + فصل ۷، گفتار ۱–۲؛ ص ۸۲–۱۰۰</w:t>
+              <w:t>فصل ۶ گ۳؛ ص۸۶–۹۰ / فصل ۷ گ۱–۳؛ ص۹۱–۱۰۶؛ ۲۱ صفحه</w:t>
             </w:r>
           </w:p>
           <w:p>
@@ -6509,7 +6509,7 @@
                 <w:szCs w:val="18"/>
                 <w:rtl w:val="1"/>
               </w:rPr>
-              <w:t>کاربرد مشتق و بهینه‌سازی</w:t>
+              <w:t>دوازدهم؛ کاربرد مشتق و بهینه‌سازی</w:t>
             </w:r>
           </w:p>
           <w:p>
@@ -6596,7 +6596,7 @@
                 <w:szCs w:val="18"/>
                 <w:rtl w:val="1"/>
               </w:rPr>
-              <w:t>فصل ۶، گفتار ۲–۳ + فصل ۷، گفتار ۱–۲؛ ص ۸۲–۱۰۰</w:t>
+              <w:t>فصل ۶ گ۳؛ ص۸۶–۹۰ / فصل ۷ گ۱–۳؛ ص۹۱–۱۰۶؛ ۲۱ صفحه</w:t>
             </w:r>
           </w:p>
           <w:p>
@@ -7279,7 +7279,7 @@
           <w:szCs w:val="12"/>
           <w:rtl w:val="1"/>
         </w:rPr>
-        <w:t>تست زیست: ۲ ساعت با تحلیل؛ صفحات شیمی مطابق ماز، نه لزوماً چاپ کتاب شما. | برنامهٔ آزمون ۲۴ اردیبهشت ۱۴۰۶ | ۱ / ۲</w:t>
+        <w:t>چاپ ۱۴۰۵ | صفحات محدوده: زیست ۶۲؛ شیمی ۵۷؛ فیزیک ۷۳؛ ریاضی ۸۴ | مرور انتخابی؛ نه خواندن کامل | ۱ / ۲</w:t>
       </w:r>
     </w:p>
     <w:tbl>
@@ -8874,7 +8874,7 @@
                 <w:szCs w:val="18"/>
                 <w:rtl w:val="1"/>
               </w:rPr>
-              <w:t>هنر و ماندگاری + آیندهٔ روشن‌تر؛ ص ماز ۸۶–۱۰۴</w:t>
+              <w:t>هنر و ماندگاری + آیندهٔ روشن‌تر؛ ص۸۶–۱۰۴؛ ۱۹ صفحه</w:t>
             </w:r>
           </w:p>
           <w:p>
@@ -9660,7 +9660,7 @@
                 <w:szCs w:val="18"/>
                 <w:rtl w:val="1"/>
               </w:rPr>
-              <w:t>هنر و ماندگاری + آیندهٔ روشن‌تر؛ ص ماز ۸۶–۱۰۴</w:t>
+              <w:t>هنر و ماندگاری + آیندهٔ روشن‌تر؛ ص۸۶–۱۰۴؛ ۱۹ صفحه</w:t>
             </w:r>
           </w:p>
           <w:p>
@@ -10715,7 +10715,7 @@
                 <w:szCs w:val="18"/>
                 <w:rtl w:val="1"/>
               </w:rPr>
-              <w:t>فصل ۷، گفتار ۳ + فصل ۸، گفتار ۱–۳؛ ص ۱۰۱–۱۲۴</w:t>
+              <w:t>فصل ۸ گ۱–۳؛ ص۱۰۷–۱۲۴؛ ۱۸ صفحه</w:t>
             </w:r>
           </w:p>
           <w:p>
@@ -10802,7 +10802,7 @@
                 <w:szCs w:val="18"/>
                 <w:rtl w:val="1"/>
               </w:rPr>
-              <w:t>هندسهٔ دوازدهم</w:t>
+              <w:t>دوازدهم؛ هندسهٔ دوازدهم</w:t>
             </w:r>
           </w:p>
           <w:p>
@@ -10889,7 +10889,7 @@
                 <w:szCs w:val="18"/>
                 <w:rtl w:val="1"/>
               </w:rPr>
-              <w:t>فصل ۷، گفتار ۳ + فصل ۸، گفتار ۱–۳؛ ص ۱۰۱–۱۲۴</w:t>
+              <w:t>فصل ۸ گ۱–۳؛ ص۱۰۷–۱۲۴؛ ۱۸ صفحه</w:t>
             </w:r>
           </w:p>
           <w:p>
@@ -11588,7 +11588,7 @@
                 <w:szCs w:val="18"/>
                 <w:rtl w:val="1"/>
               </w:rPr>
-              <w:t>احتمال دوازدهم</w:t>
+              <w:t>دوازدهم؛ احتمال دوازدهم</w:t>
             </w:r>
           </w:p>
           <w:p>
@@ -11675,7 +11675,7 @@
                 <w:szCs w:val="18"/>
                 <w:rtl w:val="1"/>
               </w:rPr>
-              <w:t>فصل ۷، گفتار ۳ + فصل ۸، گفتار ۱–۳؛ ص ۱۰۱–۱۲۴</w:t>
+              <w:t>فصل ۸ گ۱–۳؛ ص۱۰۷–۱۲۴؛ ۱۸ صفحه</w:t>
             </w:r>
           </w:p>
           <w:p>
@@ -12791,7 +12791,7 @@
                 <w:szCs w:val="18"/>
                 <w:rtl w:val="1"/>
               </w:rPr>
-              <w:t>هنر و ماندگاری + آیندهٔ روشن‌تر؛ ص ماز ۱۰۵–۱۲۳</w:t>
+              <w:t>هنر و ماندگاری + آیندهٔ روشن‌تر؛ ص۱۰۵–۱۲۳؛ ۱۹ صفحه</w:t>
             </w:r>
           </w:p>
           <w:p>
@@ -13577,7 +13577,7 @@
                 <w:szCs w:val="18"/>
                 <w:rtl w:val="1"/>
               </w:rPr>
-              <w:t>هنر و ماندگاری + آیندهٔ روشن‌تر؛ ص ماز ۱۰۵–۱۲۳</w:t>
+              <w:t>هنر و ماندگاری + آیندهٔ روشن‌تر؛ ص۱۰۵–۱۲۳؛ ۱۹ صفحه</w:t>
             </w:r>
           </w:p>
           <w:p>
@@ -14887,7 +14887,7 @@
           <w:szCs w:val="12"/>
           <w:rtl w:val="1"/>
         </w:rPr>
-        <w:t>تست زیست: ۲ ساعت با تحلیل؛ صفحات شیمی مطابق ماز، نه لزوماً چاپ کتاب شما. | برنامهٔ آزمون ۲۴ اردیبهشت ۱۴۰۶ | ۲ / ۲</w:t>
+        <w:t>چاپ ۱۴۰۵ | صفحات محدوده: زیست ۶۲؛ شیمی ۵۷؛ فیزیک ۷۳؛ ریاضی ۸۴ | مرور انتخابی؛ نه خواندن کامل | ۲ / ۲</w:t>
       </w:r>
     </w:p>
     <w:tbl>

</xml_diff>

<commit_message>
Restore pre-rewrite descriptive plans and retain current source folder
Co-authored-by: arena-agent <297053741+arena-agent@users.noreply.github.com>
</commit_message>
<xml_diff>
--- a/برنامه تحصیلی/۰۸ - اردیبهشت/۲۴ اردیبهشت/برنامه آزمون ۲۴ اردیبهشت ۱۴۰۶.docx
+++ b/برنامه تحصیلی/۰۸ - اردیبهشت/۲۴ اردیبهشت/برنامه آزمون ۲۴ اردیبهشت ۱۴۰۶.docx
@@ -2,386 +2,6 @@
 <file path=word/document.xml><?xml version="1.0" encoding="utf-8"?>
 <w:document xmlns:wpc="http://schemas.microsoft.com/office/word/2010/wordprocessingCanvas" xmlns:mo="http://schemas.microsoft.com/office/mac/office/2008/main" xmlns:mc="http://schemas.openxmlformats.org/markup-compatibility/2006" xmlns:mv="urn:schemas-microsoft-com:mac:vml" xmlns:o="urn:schemas-microsoft-com:office:office" xmlns:r="http://schemas.openxmlformats.org/officeDocument/2006/relationships" xmlns:m="http://schemas.openxmlformats.org/officeDocument/2006/math" xmlns:v="urn:schemas-microsoft-com:vml" xmlns:wp14="http://schemas.microsoft.com/office/word/2010/wordprocessingDrawing" xmlns:wp="http://schemas.openxmlformats.org/drawingml/2006/wordprocessingDrawing" xmlns:w10="urn:schemas-microsoft-com:office:word" xmlns:w="http://schemas.openxmlformats.org/wordprocessingml/2006/main" xmlns:w14="http://schemas.microsoft.com/office/word/2010/wordml" xmlns:wpg="http://schemas.microsoft.com/office/word/2010/wordprocessingGroup" xmlns:wpi="http://schemas.microsoft.com/office/word/2010/wordprocessingInk" xmlns:wne="http://schemas.microsoft.com/office/word/2006/wordml" xmlns:wps="http://schemas.microsoft.com/office/word/2010/wordprocessingShape" mc:Ignorable="w14 wp14">
   <w:body>
-    <w:p>
-      <w:pPr>
-        <w:keepNext w:val="0"/>
-        <w:widowControl w:val="0"/>
-        <w:bidi w:val="1"/>
-        <w:spacing w:before="0" w:after="240" w:line="551" w:lineRule="exact"/>
-        <w:jc w:val="start"/>
-      </w:pPr>
-      <w:r>
-        <w:rPr>
-          <w:rFonts w:ascii="Vazirmatn" w:hAnsi="Vazirmatn" w:eastAsia="Vazirmatn" w:cs="Vazirmatn"/>
-          <w:b/>
-          <w:bCs w:val="1"/>
-          <w:sz w:val="38"/>
-          <w:szCs w:val="38"/>
-          <w:rtl w:val="1"/>
-        </w:rPr>
-        <w:t>فایل برآیندی</w:t>
-      </w:r>
-    </w:p>
-    <w:p>
-      <w:pPr>
-        <w:keepNext w:val="0"/>
-        <w:widowControl w:val="0"/>
-        <w:bidi w:val="1"/>
-        <w:spacing w:before="0" w:after="240" w:line="435" w:lineRule="exact"/>
-        <w:jc w:val="start"/>
-      </w:pPr>
-      <w:r>
-        <w:rPr>
-          <w:rFonts w:ascii="Vazirmatn" w:hAnsi="Vazirmatn" w:eastAsia="Vazirmatn" w:cs="Vazirmatn"/>
-          <w:b/>
-          <w:bCs w:val="1"/>
-          <w:sz w:val="30"/>
-          <w:szCs w:val="30"/>
-          <w:rtl w:val="1"/>
-        </w:rPr>
-        <w:t>برنامهٔ آزمون ۲۴ اردیبهشت ۱۴۰۶</w:t>
-      </w:r>
-    </w:p>
-    <w:p>
-      <w:pPr>
-        <w:keepNext w:val="0"/>
-        <w:widowControl w:val="0"/>
-        <w:bidi w:val="1"/>
-        <w:spacing w:before="0" w:after="240" w:line="319" w:lineRule="exact"/>
-        <w:jc w:val="start"/>
-      </w:pPr>
-      <w:r>
-        <w:rPr>
-          <w:rFonts w:ascii="Vazirmatn" w:hAnsi="Vazirmatn" w:eastAsia="Vazirmatn" w:cs="Vazirmatn"/>
-          <w:b w:val="0"/>
-          <w:sz w:val="22"/>
-          <w:szCs w:val="22"/>
-          <w:rtl w:val="1"/>
-        </w:rPr>
-        <w:t>این نسخه با حفظ فرمول باکس‌ها، برای وضعیت خاص بودجه یا تقویم تنظیم شده است.</w:t>
-      </w:r>
-    </w:p>
-    <w:p>
-      <w:pPr>
-        <w:keepNext w:val="0"/>
-        <w:widowControl w:val="0"/>
-        <w:bidi w:val="1"/>
-        <w:spacing w:before="0" w:after="240" w:line="319" w:lineRule="exact"/>
-        <w:jc w:val="start"/>
-      </w:pPr>
-      <w:r>
-        <w:rPr>
-          <w:rFonts w:ascii="Vazirmatn" w:hAnsi="Vazirmatn" w:eastAsia="Vazirmatn" w:cs="Vazirmatn"/>
-          <w:b/>
-          <w:bCs w:val="1"/>
-          <w:sz w:val="22"/>
-          <w:szCs w:val="22"/>
-          <w:rtl w:val="1"/>
-        </w:rPr>
-        <w:t>فاصلهٔ یک‌هفته‌ای؛ شش روز مرور نیم‌سال دوم دوازدهم با همان تعداد و ساعت باکس‌های هفتگی.</w:t>
-      </w:r>
-    </w:p>
-    <w:p>
-      <w:pPr>
-        <w:keepNext w:val="0"/>
-        <w:widowControl w:val="0"/>
-        <w:bidi w:val="1"/>
-        <w:spacing w:before="0" w:after="240" w:line="290" w:lineRule="exact"/>
-        <w:jc w:val="start"/>
-      </w:pPr>
-      <w:r>
-        <w:rPr>
-          <w:rFonts w:ascii="Vazirmatn" w:hAnsi="Vazirmatn" w:eastAsia="Vazirmatn" w:cs="Vazirmatn"/>
-          <w:b w:val="0"/>
-          <w:sz w:val="20"/>
-          <w:szCs w:val="20"/>
-          <w:rtl w:val="1"/>
-        </w:rPr>
-        <w:t>فرمول ثابت هر هفته: ۲۷ باکس، ۴۷ ساعت و ۴۹۵ تست؛ زیست + ریاضی در شنبه، دوشنبه و چهارشنبه؛ فیزیک + شیمی در روزهای دیگر.</w:t>
-      </w:r>
-    </w:p>
-    <w:p>
-      <w:pPr>
-        <w:keepNext w:val="0"/>
-        <w:widowControl w:val="0"/>
-        <w:bidi w:val="1"/>
-        <w:spacing w:before="0" w:after="240" w:line="290" w:lineRule="exact"/>
-        <w:jc w:val="start"/>
-      </w:pPr>
-      <w:r>
-        <w:rPr>
-          <w:rFonts w:ascii="Vazirmatn" w:hAnsi="Vazirmatn" w:eastAsia="Vazirmatn" w:cs="Vazirmatn"/>
-          <w:b w:val="0"/>
-          <w:sz w:val="20"/>
-          <w:szCs w:val="20"/>
-          <w:rtl w:val="1"/>
-        </w:rPr>
-        <w:t>زیست: کتاب ۱ ساعت و هر باکس ۲۰ تست با تحلیل ۲ ساعت. ریاضی: درسنامهٔ اولیه ۱ ساعت و تست ۳۰تایی ۲ ساعت. فیزیک: درسنامهٔ اولیه ۲ ساعت و تست ۳۰تایی ۲ ساعت. شیمی: کتاب ۱ ساعت و تست ۲۵تایی ۲ ساعت.</w:t>
-      </w:r>
-    </w:p>
-    <w:p>
-      <w:pPr>
-        <w:keepNext w:val="0"/>
-        <w:widowControl w:val="0"/>
-        <w:bidi w:val="1"/>
-        <w:spacing w:before="0" w:after="240" w:line="290" w:lineRule="exact"/>
-        <w:jc w:val="start"/>
-      </w:pPr>
-      <w:r>
-        <w:rPr>
-          <w:rFonts w:ascii="Vazirmatn" w:hAnsi="Vazirmatn" w:eastAsia="Vazirmatn" w:cs="Vazirmatn"/>
-          <w:b w:val="0"/>
-          <w:sz w:val="20"/>
-          <w:szCs w:val="20"/>
-          <w:rtl w:val="1"/>
-        </w:rPr>
-        <w:t>مدت این فایل: ۱ هفته؛ ۴۷ ساعت و ۴۹۵ تست. آزمون و استراحت خارج از این مجموع‌اند.</w:t>
-      </w:r>
-    </w:p>
-    <w:p>
-      <w:pPr>
-        <w:keepNext w:val="0"/>
-        <w:widowControl w:val="0"/>
-        <w:bidi w:val="1"/>
-        <w:spacing w:before="0" w:after="240" w:line="290" w:lineRule="exact"/>
-        <w:jc w:val="start"/>
-      </w:pPr>
-      <w:r>
-        <w:rPr>
-          <w:rFonts w:ascii="Vazirmatn" w:hAnsi="Vazirmatn" w:eastAsia="Vazirmatn" w:cs="Vazirmatn"/>
-          <w:b w:val="0"/>
-          <w:sz w:val="20"/>
-          <w:szCs w:val="20"/>
-          <w:rtl w:val="1"/>
-        </w:rPr>
-        <w:t>در مرورهای جامع، مطالعهٔ کتاب به معنی بازیابی و مرور انتخابی متن و شکل‌های بودجه است، نه یادگیری اولیهٔ کل کتاب در یک ساعت؛ تست‌ها باید همهٔ سرفصل‌های تعیین‌شده را نمایندگی کنند.</w:t>
-      </w:r>
-    </w:p>
-    <w:p>
-      <w:pPr>
-        <w:keepNext w:val="0"/>
-        <w:widowControl w:val="0"/>
-        <w:bidi w:val="1"/>
-        <w:spacing w:before="0" w:after="240" w:line="290" w:lineRule="exact"/>
-        <w:jc w:val="start"/>
-      </w:pPr>
-      <w:r>
-        <w:rPr>
-          <w:rFonts w:ascii="Vazirmatn" w:hAnsi="Vazirmatn" w:eastAsia="Vazirmatn" w:cs="Vazirmatn"/>
-          <w:b w:val="0"/>
-          <w:sz w:val="20"/>
-          <w:szCs w:val="20"/>
-          <w:rtl w:val="1"/>
-        </w:rPr>
-        <w:t>شماره‌ها صفحهٔ چاپی کتاب‌های ۱۴۰۵ هستند، نه شمارهٔ صفحهٔ PDF. صفحهٔ مشترک مرزی فقط تا عنوان تعیین‌شده مطالعه شود. تعداد صفحات، گسترهٔ بودجه است نه تعهد خواندن کامل در مرورهای جامع.</w:t>
-      </w:r>
-    </w:p>
-    <w:p>
-      <w:pPr>
-        <w:keepNext w:val="0"/>
-        <w:widowControl w:val="0"/>
-        <w:bidi w:val="1"/>
-        <w:spacing w:before="0" w:after="240" w:line="290" w:lineRule="exact"/>
-        <w:jc w:val="start"/>
-      </w:pPr>
-      <w:r>
-        <w:rPr>
-          <w:rFonts w:ascii="Vazirmatn" w:hAnsi="Vazirmatn" w:eastAsia="Vazirmatn" w:cs="Vazirmatn"/>
-          <w:b w:val="0"/>
-          <w:sz w:val="20"/>
-          <w:szCs w:val="20"/>
-          <w:rtl w:val="1"/>
-        </w:rPr>
-        <w:t>فقط چهار درس توافق‌شده برنامه‌ریزی شده‌اند؛ زمین‌شناسیِ جدول ماز به این فرمول اضافه نشده است. منبع: جدول رسمی ارسالی ماز، صفحهٔ ۷.</w:t>
-      </w:r>
-    </w:p>
-    <w:p>
-      <w:pPr>
-        <w:keepNext w:val="0"/>
-        <w:widowControl w:val="0"/>
-        <w:bidi w:val="1"/>
-        <w:spacing w:before="0" w:after="240" w:line="261" w:lineRule="exact"/>
-        <w:jc w:val="start"/>
-      </w:pPr>
-      <w:r>
-        <w:rPr>
-          <w:rFonts w:ascii="Vazirmatn" w:hAnsi="Vazirmatn" w:eastAsia="Vazirmatn" w:cs="Vazirmatn"/>
-          <w:b w:val="0"/>
-          <w:sz w:val="18"/>
-          <w:szCs w:val="18"/>
-          <w:rtl w:val="1"/>
-        </w:rPr>
-        <w:t>هفتهٔ ۱ — دوازدهم — ۱۸ اردیبهشت تا ۲۴ اردیبهشت ۱۴۰۶</w:t>
-      </w:r>
-    </w:p>
-    <w:tbl>
-      <w:tblPr>
-        <w:tblStyle w:val="PlannerHeader"/>
-        <w:bidiVisual w:val="1"/>
-        <w:tblW w:type="dxa" w:w="11452"/>
-        <w:jc w:val="center"/>
-        <w:tblLayout w:type="fixed"/>
-        <w:tblCellMar>
-          <w:top w:w="35" w:type="dxa"/>
-          <w:bottom w:w="25" w:type="dxa"/>
-          <w:left w:w="55" w:type="dxa"/>
-          <w:right w:w="55" w:type="dxa"/>
-        </w:tblCellMar>
-        <w:tblLook w:firstColumn="1" w:firstRow="1" w:lastColumn="0" w:lastRow="0" w:noHBand="0" w:noVBand="1" w:val="04A0"/>
-      </w:tblPr>
-      <w:tblGrid>
-        <w:gridCol w:w="6350"/>
-        <w:gridCol w:w="5102"/>
-      </w:tblGrid>
-      <w:tr>
-        <w:trPr>
-          <w:cantSplit/>
-          <w:trHeight w:hRule="exact" w:val="283"/>
-        </w:trPr>
-        <w:tc>
-          <w:tcPr>
-            <w:tcW w:type="dxa" w:w="6350"/>
-            <w:tcBorders>
-              <w:bottom w:val="nil" w:sz="4" w:color="222222"/>
-              <w:left w:val="nil" w:sz="4" w:color="222222"/>
-              <w:right w:val="nil" w:sz="4" w:color="222222"/>
-              <w:top w:val="single" w:sz="4" w:color="C59B27"/>
-            </w:tcBorders>
-            <w:vAlign w:val="center"/>
-          </w:tcPr>
-          <w:p>
-            <w:pPr>
-              <w:keepNext w:val="0"/>
-              <w:widowControl w:val="0"/>
-              <w:bidi w:val="1"/>
-              <w:spacing w:before="0" w:after="0" w:line="203" w:lineRule="exact"/>
-              <w:jc w:val="start"/>
-            </w:pPr>
-            <w:r>
-              <w:rPr>
-                <w:rFonts w:ascii="Vazirmatn" w:hAnsi="Vazirmatn" w:eastAsia="Vazirmatn" w:cs="Vazirmatn"/>
-                <w:b w:val="0"/>
-                <w:sz w:val="14"/>
-                <w:szCs w:val="14"/>
-                <w:rtl w:val="1"/>
-              </w:rPr>
-              <w:t>«موفقیت استمرار روزانه در کارهای کوچک است»</w:t>
-            </w:r>
-          </w:p>
-        </w:tc>
-        <w:tc>
-          <w:tcPr>
-            <w:tcW w:type="dxa" w:w="5102"/>
-            <w:tcBorders>
-              <w:bottom w:val="nil" w:sz="4" w:color="222222"/>
-              <w:left w:val="nil" w:sz="4" w:color="222222"/>
-              <w:right w:val="nil" w:sz="4" w:color="222222"/>
-              <w:top w:val="single" w:sz="4" w:color="C59B27"/>
-            </w:tcBorders>
-            <w:vAlign w:val="center"/>
-          </w:tcPr>
-          <w:p>
-            <w:pPr>
-              <w:bidi w:val="0"/>
-              <w:spacing w:line="240" w:lineRule="exact"/>
-            </w:pPr>
-            <w:r>
-              <w:drawing>
-                <wp:inline xmlns:a="http://schemas.openxmlformats.org/drawingml/2006/main" xmlns:pic="http://schemas.openxmlformats.org/drawingml/2006/picture">
-                  <wp:extent cx="108000" cy="108000"/>
-                  <wp:docPr id="1" name="Picture 1"/>
-                  <wp:cNvGraphicFramePr>
-                    <a:graphicFrameLocks noChangeAspect="1"/>
-                  </wp:cNvGraphicFramePr>
-                  <a:graphic>
-                    <a:graphicData uri="http://schemas.openxmlformats.org/drawingml/2006/picture">
-                      <pic:pic>
-                        <pic:nvPicPr>
-                          <pic:cNvPr id="0" name="telegram.png"/>
-                          <pic:cNvPicPr/>
-                        </pic:nvPicPr>
-                        <pic:blipFill>
-                          <a:blip r:embed="rId9"/>
-                          <a:stretch>
-                            <a:fillRect/>
-                          </a:stretch>
-                        </pic:blipFill>
-                        <pic:spPr>
-                          <a:xfrm>
-                            <a:off x="0" y="0"/>
-                            <a:ext cx="108000" cy="108000"/>
-                          </a:xfrm>
-                          <a:prstGeom prst="rect"/>
-                        </pic:spPr>
-                      </pic:pic>
-                    </a:graphicData>
-                  </a:graphic>
-                </wp:inline>
-              </w:drawing>
-            </w:r>
-            <w:r>
-              <w:rPr>
-                <w:rFonts w:ascii="Vazirmatn" w:hAnsi="Vazirmatn" w:eastAsia="Vazirmatn" w:cs="Vazirmatn"/>
-                <w:sz w:val="16"/>
-                <w:rtl w:val="0"/>
-              </w:rPr>
-              <w:t xml:space="preserve"> Rotbelands   </w:t>
-            </w:r>
-            <w:r>
-              <w:drawing>
-                <wp:inline xmlns:a="http://schemas.openxmlformats.org/drawingml/2006/main" xmlns:pic="http://schemas.openxmlformats.org/drawingml/2006/picture">
-                  <wp:extent cx="108000" cy="108000"/>
-                  <wp:docPr id="2" name="Picture 2"/>
-                  <wp:cNvGraphicFramePr>
-                    <a:graphicFrameLocks noChangeAspect="1"/>
-                  </wp:cNvGraphicFramePr>
-                  <a:graphic>
-                    <a:graphicData uri="http://schemas.openxmlformats.org/drawingml/2006/picture">
-                      <pic:pic>
-                        <pic:nvPicPr>
-                          <pic:cNvPr id="0" name="instagram.png"/>
-                          <pic:cNvPicPr/>
-                        </pic:nvPicPr>
-                        <pic:blipFill>
-                          <a:blip r:embed="rId10"/>
-                          <a:stretch>
-                            <a:fillRect/>
-                          </a:stretch>
-                        </pic:blipFill>
-                        <pic:spPr>
-                          <a:xfrm>
-                            <a:off x="0" y="0"/>
-                            <a:ext cx="108000" cy="108000"/>
-                          </a:xfrm>
-                          <a:prstGeom prst="rect"/>
-                        </pic:spPr>
-                      </pic:pic>
-                    </a:graphicData>
-                  </a:graphic>
-                </wp:inline>
-              </w:drawing>
-            </w:r>
-            <w:r>
-              <w:rPr>
-                <w:rFonts w:ascii="Vazirmatn" w:hAnsi="Vazirmatn" w:eastAsia="Vazirmatn" w:cs="Vazirmatn"/>
-                <w:sz w:val="16"/>
-                <w:rtl w:val="0"/>
-              </w:rPr>
-              <w:t xml:space="preserve"> Rotbelands   </w:t>
-            </w:r>
-          </w:p>
-        </w:tc>
-      </w:tr>
-    </w:tbl>
-    <w:p>
-      <w:pPr>
-        <w:keepNext w:val="0"/>
-        <w:spacing w:before="0" w:after="0" w:line="20" w:lineRule="exact"/>
-      </w:pPr>
-      <w:r>
-        <w:br w:type="page"/>
-      </w:r>
-    </w:p>
     <w:tbl>
       <w:tblPr>
         <w:tblStyle w:val="PlannerHeader"/>
@@ -432,7 +52,7 @@
               <w:drawing>
                 <wp:inline xmlns:a="http://schemas.openxmlformats.org/drawingml/2006/main" xmlns:pic="http://schemas.openxmlformats.org/drawingml/2006/picture">
                   <wp:extent cx="468000" cy="468000"/>
-                  <wp:docPr id="3" name="Picture 3"/>
+                  <wp:docPr id="1" name="Picture 1"/>
                   <wp:cNvGraphicFramePr>
                     <a:graphicFrameLocks noChangeAspect="1"/>
                   </wp:cNvGraphicFramePr>
@@ -444,7 +64,7 @@
                           <pic:cNvPicPr/>
                         </pic:nvPicPr>
                         <pic:blipFill>
-                          <a:blip r:embed="rId11"/>
+                          <a:blip r:embed="rId9"/>
                           <a:stretch>
                             <a:fillRect/>
                           </a:stretch>
@@ -1719,7 +1339,7 @@
                 <w:szCs w:val="18"/>
                 <w:rtl w:val="1"/>
               </w:rPr>
-              <w:t>فصل ۵ گ۱–۳؛ ص۶۳–۷۶ / فصل ۶ گ۱–۲؛ ص۷۷–۸۵؛ ۲۳ صفحه</w:t>
+              <w:t>از ماده به انرژی + از انرژی به ماده؛ فصل ۵–۶؛ ص ۶۳–۸۱</w:t>
             </w:r>
           </w:p>
           <w:p>
@@ -1893,7 +1513,7 @@
                 <w:szCs w:val="18"/>
                 <w:rtl w:val="1"/>
               </w:rPr>
-              <w:t>فصل ۵ گ۱–۳؛ ص۶۳–۷۶ / فصل ۶ گ۱–۲؛ ص۷۷–۸۵؛ ۲۳ صفحه</w:t>
+              <w:t>از ماده به انرژی + از انرژی به ماده؛ فصل ۵–۶؛ ص ۶۳–۸۱</w:t>
             </w:r>
           </w:p>
           <w:p>
@@ -2592,7 +2212,7 @@
                 <w:szCs w:val="18"/>
                 <w:rtl w:val="1"/>
               </w:rPr>
-              <w:t>دوازدهم؛ مشتق و پیوستگی</w:t>
+              <w:t>مشتق و پیوستگی</w:t>
             </w:r>
           </w:p>
           <w:p>
@@ -2679,7 +2299,7 @@
                 <w:szCs w:val="18"/>
                 <w:rtl w:val="1"/>
               </w:rPr>
-              <w:t>فصل ۵ گ۱–۳؛ ص۶۳–۷۶ / فصل ۶ گ۱–۲؛ ص۷۷–۸۵؛ ۲۳ صفحه</w:t>
+              <w:t>از ماده به انرژی + از انرژی به ماده؛ فصل ۵–۶؛ ص ۶۳–۸۱</w:t>
             </w:r>
           </w:p>
           <w:p>
@@ -3795,7 +3415,7 @@
                 <w:szCs w:val="18"/>
                 <w:rtl w:val="1"/>
               </w:rPr>
-              <w:t>هنر و ماندگاری + آیندهٔ روشن‌تر؛ ص۶۷–۸۵؛ ۱۹ صفحه</w:t>
+              <w:t>هنر و ماندگاری + آیندهٔ روشن‌تر؛ ص ۶۷–۸۵</w:t>
             </w:r>
           </w:p>
           <w:p>
@@ -4581,7 +4201,7 @@
                 <w:szCs w:val="18"/>
                 <w:rtl w:val="1"/>
               </w:rPr>
-              <w:t>هنر و ماندگاری + آیندهٔ روشن‌تر؛ ص۶۷–۸۵؛ ۱۹ صفحه</w:t>
+              <w:t>هنر و ماندگاری + آیندهٔ روشن‌تر؛ ص ۶۷–۸۵</w:t>
             </w:r>
           </w:p>
           <w:p>
@@ -5636,7 +5256,7 @@
                 <w:szCs w:val="18"/>
                 <w:rtl w:val="1"/>
               </w:rPr>
-              <w:t>فصل ۶ گ۳؛ ص۸۶–۹۰ / فصل ۷ گ۱–۳؛ ص۹۱–۱۰۶؛ ۲۱ صفحه</w:t>
+              <w:t>از انرژی به ماده + فناوری‌های نوین زیستی؛ فصل ۶–۷؛ ص ۸۲–۱۰۰</w:t>
             </w:r>
           </w:p>
           <w:p>
@@ -5723,7 +5343,7 @@
                 <w:szCs w:val="18"/>
                 <w:rtl w:val="1"/>
               </w:rPr>
-              <w:t>دوازدهم؛ آهنگ تغییر و قواعد مشتق</w:t>
+              <w:t>آهنگ تغییر و قواعد مشتق</w:t>
             </w:r>
           </w:p>
           <w:p>
@@ -5810,7 +5430,7 @@
                 <w:szCs w:val="18"/>
                 <w:rtl w:val="1"/>
               </w:rPr>
-              <w:t>فصل ۶ گ۳؛ ص۸۶–۹۰ / فصل ۷ گ۱–۳؛ ص۹۱–۱۰۶؛ ۲۱ صفحه</w:t>
+              <w:t>از انرژی به ماده + فناوری‌های نوین زیستی؛ فصل ۶–۷؛ ص ۸۲–۱۰۰</w:t>
             </w:r>
           </w:p>
           <w:p>
@@ -6509,7 +6129,7 @@
                 <w:szCs w:val="18"/>
                 <w:rtl w:val="1"/>
               </w:rPr>
-              <w:t>دوازدهم؛ کاربرد مشتق و بهینه‌سازی</w:t>
+              <w:t>کاربرد مشتق و بهینه‌سازی</w:t>
             </w:r>
           </w:p>
           <w:p>
@@ -6596,7 +6216,7 @@
                 <w:szCs w:val="18"/>
                 <w:rtl w:val="1"/>
               </w:rPr>
-              <w:t>فصل ۶ گ۳؛ ص۸۶–۹۰ / فصل ۷ گ۱–۳؛ ص۹۱–۱۰۶؛ ۲۱ صفحه</w:t>
+              <w:t>از انرژی به ماده + فناوری‌های نوین زیستی؛ فصل ۶–۷؛ ص ۸۲–۱۰۰</w:t>
             </w:r>
           </w:p>
           <w:p>
@@ -7279,7 +6899,7 @@
           <w:szCs w:val="12"/>
           <w:rtl w:val="1"/>
         </w:rPr>
-        <w:t>چاپ ۱۴۰۵ | صفحات محدوده: زیست ۶۲؛ شیمی ۵۷؛ فیزیک ۷۳؛ ریاضی ۸۴ | مرور انتخابی؛ نه خواندن کامل | ۱ / ۲</w:t>
+        <w:t>تست زیست: هر باکس ۲ ساعت با تحلیل؛ استراحت و آزمون در جمع ساعت نیست. | ۱ / ۲</w:t>
       </w:r>
     </w:p>
     <w:tbl>
@@ -7357,7 +6977,7 @@
               <w:drawing>
                 <wp:inline xmlns:a="http://schemas.openxmlformats.org/drawingml/2006/main" xmlns:pic="http://schemas.openxmlformats.org/drawingml/2006/picture">
                   <wp:extent cx="108000" cy="108000"/>
-                  <wp:docPr id="4" name="Picture 4"/>
+                  <wp:docPr id="2" name="Picture 2"/>
                   <wp:cNvGraphicFramePr>
                     <a:graphicFrameLocks noChangeAspect="1"/>
                   </wp:cNvGraphicFramePr>
@@ -7369,7 +6989,7 @@
                           <pic:cNvPicPr/>
                         </pic:nvPicPr>
                         <pic:blipFill>
-                          <a:blip r:embed="rId9"/>
+                          <a:blip r:embed="rId10"/>
                           <a:stretch>
                             <a:fillRect/>
                           </a:stretch>
@@ -7399,7 +7019,7 @@
               <w:drawing>
                 <wp:inline xmlns:a="http://schemas.openxmlformats.org/drawingml/2006/main" xmlns:pic="http://schemas.openxmlformats.org/drawingml/2006/picture">
                   <wp:extent cx="108000" cy="108000"/>
-                  <wp:docPr id="5" name="Picture 5"/>
+                  <wp:docPr id="3" name="Picture 3"/>
                   <wp:cNvGraphicFramePr>
                     <a:graphicFrameLocks noChangeAspect="1"/>
                   </wp:cNvGraphicFramePr>
@@ -7411,7 +7031,7 @@
                           <pic:cNvPicPr/>
                         </pic:nvPicPr>
                         <pic:blipFill>
-                          <a:blip r:embed="rId10"/>
+                          <a:blip r:embed="rId11"/>
                           <a:stretch>
                             <a:fillRect/>
                           </a:stretch>
@@ -7500,7 +7120,7 @@
               <w:drawing>
                 <wp:inline xmlns:a="http://schemas.openxmlformats.org/drawingml/2006/main" xmlns:pic="http://schemas.openxmlformats.org/drawingml/2006/picture">
                   <wp:extent cx="468000" cy="468000"/>
-                  <wp:docPr id="6" name="Picture 6"/>
+                  <wp:docPr id="4" name="Picture 4"/>
                   <wp:cNvGraphicFramePr>
                     <a:graphicFrameLocks noChangeAspect="1"/>
                   </wp:cNvGraphicFramePr>
@@ -7512,7 +7132,7 @@
                           <pic:cNvPicPr/>
                         </pic:nvPicPr>
                         <pic:blipFill>
-                          <a:blip r:embed="rId11"/>
+                          <a:blip r:embed="rId9"/>
                           <a:stretch>
                             <a:fillRect/>
                           </a:stretch>
@@ -8874,7 +8494,7 @@
                 <w:szCs w:val="18"/>
                 <w:rtl w:val="1"/>
               </w:rPr>
-              <w:t>هنر و ماندگاری + آیندهٔ روشن‌تر؛ ص۸۶–۱۰۴؛ ۱۹ صفحه</w:t>
+              <w:t>هنر و ماندگاری + آیندهٔ روشن‌تر؛ ص ۸۶–۱۰۴</w:t>
             </w:r>
           </w:p>
           <w:p>
@@ -9660,7 +9280,7 @@
                 <w:szCs w:val="18"/>
                 <w:rtl w:val="1"/>
               </w:rPr>
-              <w:t>هنر و ماندگاری + آیندهٔ روشن‌تر؛ ص۸۶–۱۰۴؛ ۱۹ صفحه</w:t>
+              <w:t>هنر و ماندگاری + آیندهٔ روشن‌تر؛ ص ۸۶–۱۰۴</w:t>
             </w:r>
           </w:p>
           <w:p>
@@ -10715,7 +10335,7 @@
                 <w:szCs w:val="18"/>
                 <w:rtl w:val="1"/>
               </w:rPr>
-              <w:t>فصل ۸ گ۱–۳؛ ص۱۰۷–۱۲۴؛ ۱۸ صفحه</w:t>
+              <w:t>فناوری‌های نوین زیستی + رفتارهای جانوران؛ فصل ۷–۸؛ ص ۱۰۱–۱۲۴</w:t>
             </w:r>
           </w:p>
           <w:p>
@@ -10802,7 +10422,7 @@
                 <w:szCs w:val="18"/>
                 <w:rtl w:val="1"/>
               </w:rPr>
-              <w:t>دوازدهم؛ هندسهٔ دوازدهم</w:t>
+              <w:t>هندسهٔ دوازدهم</w:t>
             </w:r>
           </w:p>
           <w:p>
@@ -10889,7 +10509,7 @@
                 <w:szCs w:val="18"/>
                 <w:rtl w:val="1"/>
               </w:rPr>
-              <w:t>فصل ۸ گ۱–۳؛ ص۱۰۷–۱۲۴؛ ۱۸ صفحه</w:t>
+              <w:t>فناوری‌های نوین زیستی + رفتارهای جانوران؛ فصل ۷–۸؛ ص ۱۰۱–۱۲۴</w:t>
             </w:r>
           </w:p>
           <w:p>
@@ -11588,7 +11208,7 @@
                 <w:szCs w:val="18"/>
                 <w:rtl w:val="1"/>
               </w:rPr>
-              <w:t>دوازدهم؛ احتمال دوازدهم</w:t>
+              <w:t>احتمال دوازدهم</w:t>
             </w:r>
           </w:p>
           <w:p>
@@ -11675,7 +11295,7 @@
                 <w:szCs w:val="18"/>
                 <w:rtl w:val="1"/>
               </w:rPr>
-              <w:t>فصل ۸ گ۱–۳؛ ص۱۰۷–۱۲۴؛ ۱۸ صفحه</w:t>
+              <w:t>فناوری‌های نوین زیستی + رفتارهای جانوران؛ فصل ۷–۸؛ ص ۱۰۱–۱۲۴</w:t>
             </w:r>
           </w:p>
           <w:p>
@@ -12791,7 +12411,7 @@
                 <w:szCs w:val="18"/>
                 <w:rtl w:val="1"/>
               </w:rPr>
-              <w:t>هنر و ماندگاری + آیندهٔ روشن‌تر؛ ص۱۰۵–۱۲۳؛ ۱۹ صفحه</w:t>
+              <w:t>هنر و ماندگاری + آیندهٔ روشن‌تر؛ ص ۱۰۵–۱۲۳</w:t>
             </w:r>
           </w:p>
           <w:p>
@@ -13577,7 +13197,7 @@
                 <w:szCs w:val="18"/>
                 <w:rtl w:val="1"/>
               </w:rPr>
-              <w:t>هنر و ماندگاری + آیندهٔ روشن‌تر؛ ص۱۰۵–۱۲۳؛ ۱۹ صفحه</w:t>
+              <w:t>هنر و ماندگاری + آیندهٔ روشن‌تر؛ ص ۱۰۵–۱۲۳</w:t>
             </w:r>
           </w:p>
           <w:p>
@@ -14403,7 +14023,7 @@
                       <w:szCs w:val="16"/>
                       <w:rtl w:val="1"/>
                     </w:rPr>
-                    <w:t>آزمون هدف ماز</w:t>
+                    <w:t>آزمون</w:t>
                   </w:r>
                 </w:p>
               </w:tc>
@@ -14598,7 +14218,7 @@
                 <w:szCs w:val="18"/>
                 <w:rtl w:val="1"/>
               </w:rPr>
-              <w:t>شرکت در آزمون و تحلیل غلط‌ها و نزده‌ها؛ ثبت علت خطا و مباحث نیازمند مرور. ساعت و تعداد سؤال مطابق آزمون ثبت شود؛ باکس مطالعهٔ جدید ندارد.</w:t>
+              <w:t>شرکت در آزمون و تحلیل غلط‌ها و نزده‌ها؛ ثبت علت خطا و مباحث نیازمند مرور.</w:t>
             </w:r>
           </w:p>
         </w:tc>
@@ -14887,7 +14507,7 @@
           <w:szCs w:val="12"/>
           <w:rtl w:val="1"/>
         </w:rPr>
-        <w:t>چاپ ۱۴۰۵ | صفحات محدوده: زیست ۶۲؛ شیمی ۵۷؛ فیزیک ۷۳؛ ریاضی ۸۴ | مرور انتخابی؛ نه خواندن کامل | ۲ / ۲</w:t>
+        <w:t>تست زیست: هر باکس ۲ ساعت با تحلیل؛ استراحت و آزمون در جمع ساعت نیست. | ۲ / ۲</w:t>
       </w:r>
     </w:p>
     <w:tbl>
@@ -14965,7 +14585,7 @@
               <w:drawing>
                 <wp:inline xmlns:a="http://schemas.openxmlformats.org/drawingml/2006/main" xmlns:pic="http://schemas.openxmlformats.org/drawingml/2006/picture">
                   <wp:extent cx="108000" cy="108000"/>
-                  <wp:docPr id="7" name="Picture 7"/>
+                  <wp:docPr id="5" name="Picture 5"/>
                   <wp:cNvGraphicFramePr>
                     <a:graphicFrameLocks noChangeAspect="1"/>
                   </wp:cNvGraphicFramePr>
@@ -14977,7 +14597,7 @@
                           <pic:cNvPicPr/>
                         </pic:nvPicPr>
                         <pic:blipFill>
-                          <a:blip r:embed="rId9"/>
+                          <a:blip r:embed="rId10"/>
                           <a:stretch>
                             <a:fillRect/>
                           </a:stretch>
@@ -15007,7 +14627,7 @@
               <w:drawing>
                 <wp:inline xmlns:a="http://schemas.openxmlformats.org/drawingml/2006/main" xmlns:pic="http://schemas.openxmlformats.org/drawingml/2006/picture">
                   <wp:extent cx="108000" cy="108000"/>
-                  <wp:docPr id="8" name="Picture 8"/>
+                  <wp:docPr id="6" name="Picture 6"/>
                   <wp:cNvGraphicFramePr>
                     <a:graphicFrameLocks noChangeAspect="1"/>
                   </wp:cNvGraphicFramePr>
@@ -15019,7 +14639,7 @@
                           <pic:cNvPicPr/>
                         </pic:nvPicPr>
                         <pic:blipFill>
-                          <a:blip r:embed="rId10"/>
+                          <a:blip r:embed="rId11"/>
                           <a:stretch>
                             <a:fillRect/>
                           </a:stretch>

</xml_diff>

<commit_message>
Build monthly plans from checked current sources with descriptive clean form
Co-authored-by: arena-agent <297053741+arena-agent@users.noreply.github.com>
</commit_message>
<xml_diff>
--- a/برنامه تحصیلی/۰۸ - اردیبهشت/۲۴ اردیبهشت/برنامه آزمون ۲۴ اردیبهشت ۱۴۰۶.docx
+++ b/برنامه تحصیلی/۰۸ - اردیبهشت/۲۴ اردیبهشت/برنامه آزمون ۲۴ اردیبهشت ۱۴۰۶.docx
@@ -1339,7 +1339,7 @@
                 <w:szCs w:val="18"/>
                 <w:rtl w:val="1"/>
               </w:rPr>
-              <w:t>از ماده به انرژی + از انرژی به ماده؛ فصل ۵–۶؛ ص ۶۳–۸۱</w:t>
+              <w:t>از ماده به انرژی + از انرژی به ماده؛ فصل ۵–۶؛ ص ۶۳–۸۵</w:t>
             </w:r>
           </w:p>
           <w:p>
@@ -1513,7 +1513,7 @@
                 <w:szCs w:val="18"/>
                 <w:rtl w:val="1"/>
               </w:rPr>
-              <w:t>از ماده به انرژی + از انرژی به ماده؛ فصل ۵–۶؛ ص ۶۳–۸۱</w:t>
+              <w:t>از ماده به انرژی + از انرژی به ماده؛ فصل ۵–۶؛ ص ۶۳–۸۵</w:t>
             </w:r>
           </w:p>
           <w:p>
@@ -2299,7 +2299,7 @@
                 <w:szCs w:val="18"/>
                 <w:rtl w:val="1"/>
               </w:rPr>
-              <w:t>از ماده به انرژی + از انرژی به ماده؛ فصل ۵–۶؛ ص ۶۳–۸۱</w:t>
+              <w:t>از ماده به انرژی + از انرژی به ماده؛ فصل ۵–۶؛ ص ۶۳–۸۵</w:t>
             </w:r>
           </w:p>
           <w:p>
@@ -3415,7 +3415,7 @@
                 <w:szCs w:val="18"/>
                 <w:rtl w:val="1"/>
               </w:rPr>
-              <w:t>هنر و ماندگاری + آیندهٔ روشن‌تر؛ ص ۶۷–۸۵</w:t>
+              <w:t>شیمی، جلوه‌ای از هنر، زیبایی و ماندگاری؛ ص ۶۷–۸۵</w:t>
             </w:r>
           </w:p>
           <w:p>
@@ -4201,7 +4201,7 @@
                 <w:szCs w:val="18"/>
                 <w:rtl w:val="1"/>
               </w:rPr>
-              <w:t>هنر و ماندگاری + آیندهٔ روشن‌تر؛ ص ۶۷–۸۵</w:t>
+              <w:t>شیمی، جلوه‌ای از هنر، زیبایی و ماندگاری؛ ص ۶۷–۸۵</w:t>
             </w:r>
           </w:p>
           <w:p>
@@ -5256,7 +5256,7 @@
                 <w:szCs w:val="18"/>
                 <w:rtl w:val="1"/>
               </w:rPr>
-              <w:t>از انرژی به ماده + فناوری‌های نوین زیستی؛ فصل ۶–۷؛ ص ۸۲–۱۰۰</w:t>
+              <w:t>از انرژی به ماده + فناوری‌های نوین زیستی؛ فصل ۶–۷؛ ص ۸۶–۱۰۶</w:t>
             </w:r>
           </w:p>
           <w:p>
@@ -5430,7 +5430,7 @@
                 <w:szCs w:val="18"/>
                 <w:rtl w:val="1"/>
               </w:rPr>
-              <w:t>از انرژی به ماده + فناوری‌های نوین زیستی؛ فصل ۶–۷؛ ص ۸۲–۱۰۰</w:t>
+              <w:t>از انرژی به ماده + فناوری‌های نوین زیستی؛ فصل ۶–۷؛ ص ۸۶–۱۰۶</w:t>
             </w:r>
           </w:p>
           <w:p>
@@ -6216,7 +6216,7 @@
                 <w:szCs w:val="18"/>
                 <w:rtl w:val="1"/>
               </w:rPr>
-              <w:t>از انرژی به ماده + فناوری‌های نوین زیستی؛ فصل ۶–۷؛ ص ۸۲–۱۰۰</w:t>
+              <w:t>از انرژی به ماده + فناوری‌های نوین زیستی؛ فصل ۶–۷؛ ص ۸۶–۱۰۶</w:t>
             </w:r>
           </w:p>
           <w:p>
@@ -8494,7 +8494,7 @@
                 <w:szCs w:val="18"/>
                 <w:rtl w:val="1"/>
               </w:rPr>
-              <w:t>هنر و ماندگاری + آیندهٔ روشن‌تر؛ ص ۸۶–۱۰۴</w:t>
+              <w:t>شیمی، جلوه‌ای از هنر، زیبایی و ماندگاری؛ ص ۸۶–۹۰ / شیمی، راهی به سوی آینده‌ای روشن‌تر؛ ص ۹۱–۱۰۴</w:t>
             </w:r>
           </w:p>
           <w:p>
@@ -9280,7 +9280,7 @@
                 <w:szCs w:val="18"/>
                 <w:rtl w:val="1"/>
               </w:rPr>
-              <w:t>هنر و ماندگاری + آیندهٔ روشن‌تر؛ ص ۸۶–۱۰۴</w:t>
+              <w:t>شیمی، جلوه‌ای از هنر، زیبایی و ماندگاری؛ ص ۸۶–۹۰ / شیمی، راهی به سوی آینده‌ای روشن‌تر؛ ص ۹۱–۱۰۴</w:t>
             </w:r>
           </w:p>
           <w:p>
@@ -10335,7 +10335,7 @@
                 <w:szCs w:val="18"/>
                 <w:rtl w:val="1"/>
               </w:rPr>
-              <w:t>فناوری‌های نوین زیستی + رفتارهای جانوران؛ فصل ۷–۸؛ ص ۱۰۱–۱۲۴</w:t>
+              <w:t>اساس رفتار + انتخاب طبیعی و رفتار + ارتباط و زندگی گروهی؛ فصل ۸، گفتار ۱–۳؛ ص ۱۰۷–۱۲۴</w:t>
             </w:r>
           </w:p>
           <w:p>
@@ -10509,7 +10509,7 @@
                 <w:szCs w:val="18"/>
                 <w:rtl w:val="1"/>
               </w:rPr>
-              <w:t>فناوری‌های نوین زیستی + رفتارهای جانوران؛ فصل ۷–۸؛ ص ۱۰۱–۱۲۴</w:t>
+              <w:t>اساس رفتار + انتخاب طبیعی و رفتار + ارتباط و زندگی گروهی؛ فصل ۸، گفتار ۱–۳؛ ص ۱۰۷–۱۲۴</w:t>
             </w:r>
           </w:p>
           <w:p>
@@ -11295,7 +11295,7 @@
                 <w:szCs w:val="18"/>
                 <w:rtl w:val="1"/>
               </w:rPr>
-              <w:t>فناوری‌های نوین زیستی + رفتارهای جانوران؛ فصل ۷–۸؛ ص ۱۰۱–۱۲۴</w:t>
+              <w:t>اساس رفتار + انتخاب طبیعی و رفتار + ارتباط و زندگی گروهی؛ فصل ۸، گفتار ۱–۳؛ ص ۱۰۷–۱۲۴</w:t>
             </w:r>
           </w:p>
           <w:p>
@@ -12411,7 +12411,7 @@
                 <w:szCs w:val="18"/>
                 <w:rtl w:val="1"/>
               </w:rPr>
-              <w:t>هنر و ماندگاری + آیندهٔ روشن‌تر؛ ص ۱۰۵–۱۲۳</w:t>
+              <w:t>شیمی، راهی به سوی آینده‌ای روشن‌تر؛ ص ۱۰۵–۱۲۳</w:t>
             </w:r>
           </w:p>
           <w:p>
@@ -13197,7 +13197,7 @@
                 <w:szCs w:val="18"/>
                 <w:rtl w:val="1"/>
               </w:rPr>
-              <w:t>هنر و ماندگاری + آیندهٔ روشن‌تر؛ ص ۱۰۵–۱۲۳</w:t>
+              <w:t>شیمی، راهی به سوی آینده‌ای روشن‌تر؛ ص ۱۰۵–۱۲۳</w:t>
             </w:r>
           </w:p>
           <w:p>

</xml_diff>